<commit_message>
Add illustrations to Primary 1 Term 3 Week 6 lesson note (Digital Citizenship)
</commit_message>
<xml_diff>
--- a/downloads/Rehoteq_Lesson_Note_P1_T3_W6_Digital_Citizenship.docx
+++ b/downloads/Rehoteq_Lesson_Note_P1_T3_W6_Digital_Citizenship.docx
@@ -1004,7 +1004,235 @@
         <w:pStyle w:val="Heading1"/>
       </w:pPr>
       <w:r>
-        <w:t>6. Period Two: Practise and Apply</w:t>
+        <w:t>6. Lesson Pictures</w:t>
+      </w:r>
+    </w:p>
+    <w:p>
+      <w:pPr>
+        <w:spacing w:after="120"/>
+      </w:pPr>
+      <w:r>
+        <w:rPr>
+          <w:b w:val="0"/>
+          <w:i w:val="0"/>
+        </w:rPr>
+        <w:t>The illustrations below are original Rehoteq sample pictures for this lesson. Each carries a text caption, and important information does not depend on colour alone. Teachers can show them on a screen, print them, or describe them on the board.</w:t>
+      </w:r>
+    </w:p>
+    <w:p>
+      <w:pPr>
+        <w:jc w:val="center"/>
+      </w:pPr>
+      <w:r>
+        <w:drawing>
+          <wp:inline xmlns:a="http://schemas.openxmlformats.org/drawingml/2006/main" xmlns:pic="http://schemas.openxmlformats.org/drawingml/2006/picture">
+            <wp:extent cx="4680000" cy="3120000" descr="A young Nigerian schoolgirl in a green uniform raises her hand to ask for her turn with the class tablet while her classmate waits beside her."/>
+            <wp:docPr id="1" name="Picture 1"/>
+            <wp:cNvGraphicFramePr>
+              <a:graphicFrameLocks noChangeAspect="1"/>
+            </wp:cNvGraphicFramePr>
+            <a:graphic>
+              <a:graphicData uri="http://schemas.openxmlformats.org/drawingml/2006/picture">
+                <pic:pic>
+                  <pic:nvPicPr>
+                    <pic:cNvPr id="0" name="t3w6_1.png"/>
+                    <pic:cNvPicPr/>
+                  </pic:nvPicPr>
+                  <pic:blipFill>
+                    <a:blip r:embed="rId11"/>
+                    <a:stretch>
+                      <a:fillRect/>
+                    </a:stretch>
+                  </pic:blipFill>
+                  <pic:spPr>
+                    <a:xfrm>
+                      <a:off x="0" y="0"/>
+                      <a:ext cx="4680000" cy="3120000"/>
+                    </a:xfrm>
+                    <a:prstGeom prst="rect"/>
+                  </pic:spPr>
+                </pic:pic>
+              </a:graphicData>
+            </a:graphic>
+          </wp:inline>
+        </w:drawing>
+      </w:r>
+    </w:p>
+    <w:p>
+      <w:pPr>
+        <w:jc w:val="center"/>
+      </w:pPr>
+      <w:r>
+        <w:rPr>
+          <w:i/>
+          <w:color w:val="555555"/>
+          <w:sz w:val="18"/>
+        </w:rPr>
+        <w:t>Picture 1. Ask first: the pupil raises her hand to take her turn with the shared tablet, and her classmate waits politely.</w:t>
+      </w:r>
+    </w:p>
+    <w:p>
+      <w:pPr>
+        <w:jc w:val="center"/>
+      </w:pPr>
+      <w:r>
+        <w:drawing>
+          <wp:inline xmlns:a="http://schemas.openxmlformats.org/drawingml/2006/main" xmlns:pic="http://schemas.openxmlformats.org/drawingml/2006/picture">
+            <wp:extent cx="4680000" cy="3120000" descr="A young Nigerian schoolboy in a green uniform holds the class tablet close to his chest, keeping what is on it private and safe."/>
+            <wp:docPr id="2" name="Picture 2"/>
+            <wp:cNvGraphicFramePr>
+              <a:graphicFrameLocks noChangeAspect="1"/>
+            </wp:cNvGraphicFramePr>
+            <a:graphic>
+              <a:graphicData uri="http://schemas.openxmlformats.org/drawingml/2006/picture">
+                <pic:pic>
+                  <pic:nvPicPr>
+                    <pic:cNvPr id="0" name="t3w6_2.png"/>
+                    <pic:cNvPicPr/>
+                  </pic:nvPicPr>
+                  <pic:blipFill>
+                    <a:blip r:embed="rId12"/>
+                    <a:stretch>
+                      <a:fillRect/>
+                    </a:stretch>
+                  </pic:blipFill>
+                  <pic:spPr>
+                    <a:xfrm>
+                      <a:off x="0" y="0"/>
+                      <a:ext cx="4680000" cy="3120000"/>
+                    </a:xfrm>
+                    <a:prstGeom prst="rect"/>
+                  </pic:spPr>
+                </pic:pic>
+              </a:graphicData>
+            </a:graphic>
+          </wp:inline>
+        </w:drawing>
+      </w:r>
+    </w:p>
+    <w:p>
+      <w:pPr>
+        <w:jc w:val="center"/>
+      </w:pPr>
+      <w:r>
+        <w:rPr>
+          <w:i/>
+          <w:color w:val="555555"/>
+          <w:sz w:val="18"/>
+        </w:rPr>
+        <w:t>Picture 2. Keep it private: the pupil holds the tablet close and does not share other people's pictures or words.</w:t>
+      </w:r>
+    </w:p>
+    <w:p>
+      <w:pPr>
+        <w:jc w:val="center"/>
+      </w:pPr>
+      <w:r>
+        <w:drawing>
+          <wp:inline xmlns:a="http://schemas.openxmlformats.org/drawingml/2006/main" xmlns:pic="http://schemas.openxmlformats.org/drawingml/2006/picture">
+            <wp:extent cx="4680000" cy="3120000" descr="Two young Nigerian pupils in green uniforms smile and take turns using the shared tablet together at their wooden desk."/>
+            <wp:docPr id="3" name="Picture 3"/>
+            <wp:cNvGraphicFramePr>
+              <a:graphicFrameLocks noChangeAspect="1"/>
+            </wp:cNvGraphicFramePr>
+            <a:graphic>
+              <a:graphicData uri="http://schemas.openxmlformats.org/drawingml/2006/picture">
+                <pic:pic>
+                  <pic:nvPicPr>
+                    <pic:cNvPr id="0" name="t3w6_3.png"/>
+                    <pic:cNvPicPr/>
+                  </pic:nvPicPr>
+                  <pic:blipFill>
+                    <a:blip r:embed="rId13"/>
+                    <a:stretch>
+                      <a:fillRect/>
+                    </a:stretch>
+                  </pic:blipFill>
+                  <pic:spPr>
+                    <a:xfrm>
+                      <a:off x="0" y="0"/>
+                      <a:ext cx="4680000" cy="3120000"/>
+                    </a:xfrm>
+                    <a:prstGeom prst="rect"/>
+                  </pic:spPr>
+                </pic:pic>
+              </a:graphicData>
+            </a:graphic>
+          </wp:inline>
+        </w:drawing>
+      </w:r>
+    </w:p>
+    <w:p>
+      <w:pPr>
+        <w:jc w:val="center"/>
+      </w:pPr>
+      <w:r>
+        <w:rPr>
+          <w:i/>
+          <w:color w:val="555555"/>
+          <w:sz w:val="18"/>
+        </w:rPr>
+        <w:t>Picture 3. Be kind: partners take turns and say kind words to each other while they use the tablet together.</w:t>
+      </w:r>
+    </w:p>
+    <w:p>
+      <w:pPr>
+        <w:jc w:val="center"/>
+      </w:pPr>
+      <w:r>
+        <w:drawing>
+          <wp:inline xmlns:a="http://schemas.openxmlformats.org/drawingml/2006/main" xmlns:pic="http://schemas.openxmlformats.org/drawingml/2006/picture">
+            <wp:extent cx="4680000" cy="3120000" descr="A Nigerian female teacher in a bright ankara-print dress holds up her hand like a stop sign as she explains the class device rules to pupils seated on the mat."/>
+            <wp:docPr id="4" name="Picture 4"/>
+            <wp:cNvGraphicFramePr>
+              <a:graphicFrameLocks noChangeAspect="1"/>
+            </wp:cNvGraphicFramePr>
+            <a:graphic>
+              <a:graphicData uri="http://schemas.openxmlformats.org/drawingml/2006/picture">
+                <pic:pic>
+                  <pic:nvPicPr>
+                    <pic:cNvPr id="0" name="t3w6_4.png"/>
+                    <pic:cNvPicPr/>
+                  </pic:nvPicPr>
+                  <pic:blipFill>
+                    <a:blip r:embed="rId14"/>
+                    <a:stretch>
+                      <a:fillRect/>
+                    </a:stretch>
+                  </pic:blipFill>
+                  <pic:spPr>
+                    <a:xfrm>
+                      <a:off x="0" y="0"/>
+                      <a:ext cx="4680000" cy="3120000"/>
+                    </a:xfrm>
+                    <a:prstGeom prst="rect"/>
+                  </pic:spPr>
+                </pic:pic>
+              </a:graphicData>
+            </a:graphic>
+          </wp:inline>
+        </w:drawing>
+      </w:r>
+    </w:p>
+    <w:p>
+      <w:pPr>
+        <w:jc w:val="center"/>
+      </w:pPr>
+      <w:r>
+        <w:rPr>
+          <w:i/>
+          <w:color w:val="555555"/>
+          <w:sz w:val="18"/>
+        </w:rPr>
+        <w:t>Picture 4. Our rules: the teacher explains the class rules for using devices kindly and safely.</w:t>
+      </w:r>
+    </w:p>
+    <w:p>
+      <w:pPr>
+        <w:pStyle w:val="Heading1"/>
+      </w:pPr>
+      <w:r>
+        <w:t>7. Period Two: Practise and Apply</w:t>
       </w:r>
     </w:p>
     <w:p>
@@ -1036,7 +1264,7 @@
         <w:pStyle w:val="Heading1"/>
       </w:pPr>
       <w:r>
-        <w:t>7. Assessment and Evidence</w:t>
+        <w:t>8. Assessment and Evidence</w:t>
       </w:r>
     </w:p>
     <w:p>
@@ -1064,7 +1292,7 @@
         <w:pStyle w:val="Heading1"/>
       </w:pPr>
       <w:r>
-        <w:t>8. Suggested Questions and Answer Guidance</w:t>
+        <w:t>9. Suggested Questions and Answer Guidance</w:t>
       </w:r>
     </w:p>
     <w:p>
@@ -1099,7 +1327,7 @@
         <w:pStyle w:val="Heading1"/>
       </w:pPr>
       <w:r>
-        <w:t>9. Home Activity</w:t>
+        <w:t>10. Home Activity</w:t>
       </w:r>
     </w:p>
     <w:p>
@@ -1119,7 +1347,7 @@
         <w:pStyle w:val="Heading1"/>
       </w:pPr>
       <w:r>
-        <w:t>10. Inclusion</w:t>
+        <w:t>11. Inclusion</w:t>
       </w:r>
     </w:p>
     <w:p>
@@ -1139,7 +1367,7 @@
         <w:pStyle w:val="Heading1"/>
       </w:pPr>
       <w:r>
-        <w:t>11. Safety and Privacy</w:t>
+        <w:t>12. Safety and Privacy</w:t>
       </w:r>
     </w:p>
     <w:p>
@@ -1159,7 +1387,7 @@
         <w:pStyle w:val="Heading1"/>
       </w:pPr>
       <w:r>
-        <w:t>12. Teacher Reflection</w:t>
+        <w:t>13. Teacher Reflection</w:t>
       </w:r>
     </w:p>
     <w:p>
@@ -1197,7 +1425,7 @@
         <w:pStyle w:val="Heading1"/>
       </w:pPr>
       <w:r>
-        <w:t>13. Curriculum Alignment and Document Status</w:t>
+        <w:t>14. Curriculum Alignment and Document Status</w:t>
       </w:r>
     </w:p>
     <w:tbl>

</xml_diff>